<commit_message>
Add Ali's text-density suggestions to the proposed-changes doc
Part 2 of docs/Shaping-Change-Proposed-Changes-Anu.docx: Ali's
structural suggestions (support-line placement, one title per
screen) and current-vs-suggested wording for 11 screens/lines, from
"Suggestions to the game.docx".

Flagged the support-line placement suggestion as a real conflict
with an existing, automatically-enforced safety guardrail (the
1800RESPECT/000 line showing on every screen) that needs explicit
PVAW sign-off — not a copy-editing decision. Everything else is
low-risk wording trims. Planning only, no game code changed.

Co-Authored-By: Claude Sonnet 5 <noreply@anthropic.com>
</commit_message>
<xml_diff>
--- a/docs/Shaping-Change-Proposed-Changes-Anu.docx
+++ b/docs/Shaping-Change-Proposed-Changes-Anu.docx
@@ -23,7 +23,7 @@
           <w:color w:val="B0861A"/>
           <w:sz w:val="28"/>
         </w:rPr>
-        <w:t>Proposed Changes Against Anu’s Feedback</w:t>
+        <w:t>Proposed Changes — Anu’s Feedback &amp; Ali’s Text Suggestions</w:t>
       </w:r>
     </w:p>
     <w:p>
@@ -37,7 +37,31 @@
           <w:color w:val="554D40"/>
           <w:sz w:val="21"/>
         </w:rPr>
-        <w:t>A screen-by-screen proposal for what the multi-select and related changes would actually involve, based on Anu’s replies (17 September 2026) to Oleksandra’s comments. This is a planning document, not a build — nothing here has been implemented yet.</w:t>
+        <w:t>Part 1 is a screen-by-screen proposal for what the multi-select and related changes would actually involve, based on Anu’s replies (17 September 2026) to Oleksandra’s comments. Part 2 covers Ali’s suggestions for cutting down on-screen text, from "Suggestions to the game.docx" (17 September 2026). This is a planning document, not a build — nothing here has been implemented yet.</w:t>
+      </w:r>
+    </w:p>
+    <w:p>
+      <w:pPr>
+        <w:spacing w:before="120" w:after="120"/>
+      </w:pPr>
+      <w:r>
+        <w:rPr>
+          <w:color w:val="CCC4B6"/>
+        </w:rPr>
+        <w:t>____________________________________________________________</w:t>
+      </w:r>
+    </w:p>
+    <w:p>
+      <w:pPr>
+        <w:spacing w:before="120" w:after="200"/>
+      </w:pPr>
+      <w:r>
+        <w:rPr>
+          <w:b/>
+          <w:color w:val="2A1F10"/>
+          <w:sz w:val="32"/>
+        </w:rPr>
+        <w:t>Part 1 — Anu’s feedback on Oleksandra’s comments</w:t>
       </w:r>
     </w:p>
     <w:p>
@@ -914,7 +938,34 @@
     </w:p>
     <w:p>
       <w:pPr>
-        <w:spacing w:before="200" w:after="80"/>
+        <w:spacing w:before="360" w:after="200"/>
+      </w:pPr>
+      <w:r>
+        <w:rPr>
+          <w:b/>
+          <w:color w:val="2A1F10"/>
+          <w:sz w:val="32"/>
+        </w:rPr>
+        <w:t>Part 2 — Ali’s suggestions: cutting down the text</w:t>
+      </w:r>
+    </w:p>
+    <w:p>
+      <w:pPr>
+        <w:spacing w:after="120" w:before="0"/>
+      </w:pPr>
+      <w:r>
+        <w:rPr>
+          <w:b w:val="0"/>
+          <w:i/>
+          <w:color w:val="554D40"/>
+          <w:sz w:val="21"/>
+        </w:rPr>
+        <w:t>Two structural suggestions, then shorter replacement wording for eleven screens/lines. None of this has been applied yet.</w:t>
+      </w:r>
+    </w:p>
+    <w:p>
+      <w:pPr>
+        <w:spacing w:before="280" w:after="80"/>
       </w:pPr>
       <w:r>
         <w:rPr>
@@ -922,29 +973,936 @@
           <w:color w:val="B0861A"/>
           <w:sz w:val="26"/>
         </w:rPr>
-        <w:t>Not included in this proposal</w:t>
+        <w:t>1. Show 1800RESPECT / 000 on the last screen only</w:t>
       </w:r>
     </w:p>
     <w:p>
       <w:pPr>
-        <w:pStyle w:val="ListBullet"/>
-        <w:spacing w:after="60"/>
+        <w:spacing w:before="120" w:after="120"/>
+        <w:ind w:left="200"/>
+        <w:shd w:val="clear" w:color="auto" w:fill="F3F1EB"/>
       </w:pPr>
       <w:r>
-        <w:t>Text density — still pending a joint decision from Ali and Anu. Once that lands, it may touch some of the same screens above, so it makes sense to fold both changes into one pass rather than editing the same screens twice.</w:t>
+        <w:rPr>
+          <w:b/>
+          <w:i/>
+          <w:color w:val="554D40"/>
+          <w:sz w:val="20"/>
+        </w:rPr>
+        <w:t xml:space="preserve">Ali:  </w:t>
+      </w:r>
+      <w:r>
+        <w:rPr>
+          <w:i/>
+          <w:color w:val="554D40"/>
+          <w:sz w:val="20"/>
+        </w:rPr>
+        <w:t>"The 1800RESPECT and 000 numbers to appear on the last screen only. The order to be 000 followed by 1800RESPECT."</w:t>
       </w:r>
     </w:p>
     <w:p>
       <w:pPr>
-        <w:spacing w:before="280"/>
-      </w:pPr>
+        <w:spacing w:after="40" w:before="120"/>
+      </w:pPr>
+      <w:r>
+        <w:rPr>
+          <w:b/>
+          <w:color w:val="B01A1A"/>
+          <w:sz w:val="18"/>
+        </w:rPr>
+        <w:t>CONFLICTS WITH AN EXISTING SAFETY GUARDRAIL — NEEDS PVAW SIGN-OFF</w:t>
+      </w:r>
+    </w:p>
+    <w:p>
+      <w:pPr>
+        <w:spacing w:after="120" w:before="0"/>
+      </w:pPr>
+      <w:r>
+        <w:rPr>
+          <w:b w:val="0"/>
+          <w:i w:val="0"/>
+          <w:sz w:val="21"/>
+        </w:rPr>
+        <w:t>This isn’t a copy edit — it reverses a specific, documented pedagogy decision: "the 1800RESPECT / 000 support line shows on every screen," which is checked automatically on every content change (the build fails if any screen is missing it). That rule exists so the support line is always visible without a learner needing to reach the end of the activity. Removing it from every screen but the last is a real safety-design change, not a text-density one, so this needs Anu/PVAW’s explicit confirmation before it happens — the same weight as the multi-select decision in Part 1, not something to fold in quietly alongside the wording trims below.</w:t>
+      </w:r>
+    </w:p>
+    <w:p>
+      <w:pPr>
+        <w:spacing w:after="120" w:before="0"/>
+      </w:pPr>
+      <w:r>
+        <w:rPr>
+          <w:b w:val="0"/>
+          <w:i/>
+          <w:color w:val="554D40"/>
+          <w:sz w:val="21"/>
+        </w:rPr>
+        <w:t>If it does get confirmed, the reorder (000 before 1800RESPECT) is the easy part.</w:t>
+      </w:r>
+    </w:p>
+    <w:p>
+      <w:pPr>
+        <w:spacing w:before="280" w:after="80"/>
+      </w:pPr>
+      <w:r>
+        <w:rPr>
+          <w:b/>
+          <w:color w:val="B0861A"/>
+          <w:sz w:val="26"/>
+        </w:rPr>
+        <w:t>2. One screen title per screen, not several</w:t>
+      </w:r>
+    </w:p>
+    <w:p>
+      <w:pPr>
+        <w:spacing w:before="120" w:after="120"/>
+        <w:ind w:left="200"/>
+        <w:shd w:val="clear" w:color="auto" w:fill="F3F1EB"/>
+      </w:pPr>
+      <w:r>
+        <w:rPr>
+          <w:b/>
+          <w:i/>
+          <w:color w:val="554D40"/>
+          <w:sz w:val="20"/>
+        </w:rPr>
+        <w:t xml:space="preserve">Ali:  </w:t>
+      </w:r>
+      <w:r>
+        <w:rPr>
+          <w:i/>
+          <w:color w:val="554D40"/>
+          <w:sz w:val="20"/>
+        </w:rPr>
+        <w:t>"To have only one screen title to identify each screen (currently there are a couple of titles for each screen — example: "step 3 of 10" / "phase 1. what does he do?" / "the pressure is heavy, what does Orion do?")"</w:t>
+      </w:r>
+    </w:p>
+    <w:p>
+      <w:pPr>
+        <w:spacing w:after="120" w:before="0"/>
+      </w:pPr>
+      <w:r>
+        <w:rPr>
+          <w:b w:val="0"/>
+          <w:i w:val="0"/>
+          <w:sz w:val="21"/>
+        </w:rPr>
+        <w:t>Reading this as: keep the step-progress indicator (the dots + "Step X of 10", since that’s orientation, not really a "title") and the actual question/heading — and drop the middle line (the "Phase 1 · ..." tag), which mostly repeats what the heading already says. Worth confirming that’s the intended reading before it’s applied everywhere, since it touches every single screen in the game.</w:t>
+      </w:r>
+    </w:p>
+    <w:p>
+      <w:pPr>
+        <w:spacing w:before="80" w:after="40"/>
+      </w:pPr>
+      <w:r>
+        <w:rPr>
+          <w:b/>
+          <w:color w:val="554D40"/>
+          <w:sz w:val="19"/>
+        </w:rPr>
+        <w:t xml:space="preserve">Scope: </w:t>
+      </w:r>
+      <w:r>
+        <w:rPr>
+          <w:b/>
+          <w:color w:val="1E7A3C"/>
+          <w:sz w:val="19"/>
+        </w:rPr>
+        <w:t>Small — a consistent CSS/markup change once the interpretation above is confirmed.</w:t>
+      </w:r>
+    </w:p>
+    <w:p>
+      <w:pPr>
+        <w:spacing w:before="320" w:after="80"/>
+      </w:pPr>
+      <w:r>
+        <w:rPr>
+          <w:b/>
+          <w:color w:val="B0861A"/>
+          <w:sz w:val="26"/>
+        </w:rPr>
+        <w:t>3. Shorter wording, screen by screen</w:t>
+      </w:r>
+    </w:p>
+    <w:p>
+      <w:pPr>
+        <w:spacing w:after="120" w:before="0"/>
+      </w:pPr>
+      <w:r>
+        <w:rPr>
+          <w:b w:val="0"/>
+          <w:i/>
+          <w:color w:val="554D40"/>
+          <w:sz w:val="21"/>
+        </w:rPr>
+        <w:t>Ali’s versions are generally shorter and keep the core teaching point; a couple of specific personal-detail callbacks (e.g. "Since 2023..." on the tree screen) are dropped in the interest of brevity — flagged where that happens, otherwise nothing substantive seems to be lost.</w:t>
+      </w:r>
+    </w:p>
+    <w:p>
+      <w:pPr>
+        <w:spacing w:before="360" w:after="40"/>
+      </w:pPr>
+      <w:r>
+        <w:rPr>
+          <w:b/>
+          <w:color w:val="B0861A"/>
+          <w:sz w:val="28"/>
+        </w:rPr>
+        <w:t>Screen 03 — Money worries</w:t>
+      </w:r>
+    </w:p>
+    <w:p>
+      <w:pPr>
+        <w:spacing w:before="120" w:after="60"/>
+        <w:ind w:left="200"/>
+        <w:shd w:val="clear" w:color="auto" w:fill="F3F1EB"/>
+      </w:pPr>
+      <w:r>
+        <w:rPr>
+          <w:b/>
+          <w:color w:val="554D40"/>
+          <w:sz w:val="19"/>
+        </w:rPr>
+        <w:t xml:space="preserve">Current:  </w:t>
+      </w:r>
       <w:r>
         <w:rPr>
           <w:i/>
           <w:color w:val="554D40"/>
           <w:sz w:val="19"/>
         </w:rPr>
-        <w:t>Once the two flagged decisions above are settled (the scoring question, and the no-scroll approach for multi-select reasoning text), the small/medium items (08, 22, then 06, 11, 12) can be built in one pass. Screen 13 is better run as a separate, content-led follow-up.</w:t>
+        <w:t>Back home, Orion trained and worked as an engineer. Here, the doors keep closing: his overseas qualifications are not recognised, employers want local experience he has not had a chance to get, and he has few contacts to help him find work. These barriers are common for new arrivals — they are not his fault. Orion is trying hard, but money is tight, and he worries every day.</w:t>
+      </w:r>
+    </w:p>
+    <w:p>
+      <w:pPr>
+        <w:spacing w:before="40" w:after="120"/>
+        <w:ind w:left="200"/>
+        <w:shd w:val="clear" w:color="auto" w:fill="EFF6EF"/>
+      </w:pPr>
+      <w:r>
+        <w:rPr>
+          <w:b/>
+          <w:color w:val="1E7A3C"/>
+          <w:sz w:val="19"/>
+        </w:rPr>
+        <w:t xml:space="preserve">Ali’s suggestion:  </w:t>
+      </w:r>
+      <w:r>
+        <w:rPr>
+          <w:color w:val="2A1F10"/>
+          <w:sz w:val="19"/>
+        </w:rPr>
+        <w:t>Orion trained and worked as an engineer back home. Here, his qualifications are not recognised, employers want local experience, and he has few professional contacts. Work is hard to find, money is tight, and he worries every day.</w:t>
+      </w:r>
+    </w:p>
+    <w:p>
+      <w:pPr>
+        <w:spacing w:before="360" w:after="40"/>
+      </w:pPr>
+      <w:r>
+        <w:rPr>
+          <w:b/>
+          <w:color w:val="B0861A"/>
+          <w:sz w:val="28"/>
+        </w:rPr>
+        <w:t>Screen 04 — A changing role</w:t>
+      </w:r>
+    </w:p>
+    <w:p>
+      <w:pPr>
+        <w:spacing w:before="120" w:after="60"/>
+        <w:ind w:left="200"/>
+        <w:shd w:val="clear" w:color="auto" w:fill="F3F1EB"/>
+      </w:pPr>
+      <w:r>
+        <w:rPr>
+          <w:b/>
+          <w:color w:val="554D40"/>
+          <w:sz w:val="19"/>
+        </w:rPr>
+        <w:t xml:space="preserve">Current:  </w:t>
+      </w:r>
+      <w:r>
+        <w:rPr>
+          <w:i/>
+          <w:color w:val="554D40"/>
+          <w:sz w:val="19"/>
+        </w:rPr>
+        <w:t>His wife wants to study and find work. His children want to choose their own paths. He no longer feels that his family members respect him or listen to him. He feels his role in the family is changing. He feels unheard and unsure.</w:t>
+      </w:r>
+    </w:p>
+    <w:p>
+      <w:pPr>
+        <w:spacing w:before="40" w:after="120"/>
+        <w:ind w:left="200"/>
+        <w:shd w:val="clear" w:color="auto" w:fill="EFF6EF"/>
+      </w:pPr>
+      <w:r>
+        <w:rPr>
+          <w:b/>
+          <w:color w:val="1E7A3C"/>
+          <w:sz w:val="19"/>
+        </w:rPr>
+        <w:t xml:space="preserve">Ali’s suggestion:  </w:t>
+      </w:r>
+      <w:r>
+        <w:rPr>
+          <w:color w:val="2A1F10"/>
+          <w:sz w:val="19"/>
+        </w:rPr>
+        <w:t>His wife wants to study and work, while his children want to choose their own paths. Orion feels his role in the family is changing. He feels unheard and uncertain.</w:t>
+      </w:r>
+    </w:p>
+    <w:p>
+      <w:pPr>
+        <w:spacing w:before="360" w:after="40"/>
+      </w:pPr>
+      <w:r>
+        <w:rPr>
+          <w:b/>
+          <w:color w:val="B0861A"/>
+          <w:sz w:val="28"/>
+        </w:rPr>
+        <w:t>Screen 05 — Two big pressures</w:t>
+      </w:r>
+    </w:p>
+    <w:p>
+      <w:pPr>
+        <w:spacing w:before="120" w:after="60"/>
+        <w:ind w:left="200"/>
+        <w:shd w:val="clear" w:color="auto" w:fill="F3F1EB"/>
+      </w:pPr>
+      <w:r>
+        <w:rPr>
+          <w:b/>
+          <w:color w:val="554D40"/>
+          <w:sz w:val="19"/>
+        </w:rPr>
+        <w:t xml:space="preserve">Current:  </w:t>
+      </w:r>
+      <w:r>
+        <w:rPr>
+          <w:i/>
+          <w:color w:val="554D40"/>
+          <w:sz w:val="19"/>
+        </w:rPr>
+        <w:t>Orion is facing two big pressures that many new arrivals know. One is migration pressure — a new language, hard to find work, and few social connections. The other is loss of status — back home he was respected and led others; here he can feel unseen, like starting from zero. These pressures are not his fault, but they shape how he feels and acts. Orion is not sure where to go, and he has a choice to make.</w:t>
+      </w:r>
+    </w:p>
+    <w:p>
+      <w:pPr>
+        <w:spacing w:before="40" w:after="120"/>
+        <w:ind w:left="200"/>
+        <w:shd w:val="clear" w:color="auto" w:fill="EFF6EF"/>
+      </w:pPr>
+      <w:r>
+        <w:rPr>
+          <w:b/>
+          <w:color w:val="1E7A3C"/>
+          <w:sz w:val="19"/>
+        </w:rPr>
+        <w:t xml:space="preserve">Ali’s suggestion:  </w:t>
+      </w:r>
+      <w:r>
+        <w:rPr>
+          <w:color w:val="2A1F10"/>
+          <w:sz w:val="19"/>
+        </w:rPr>
+        <w:t>Orion is facing challenges many new arrivals experience. Finding work is difficult, social connections are limited, and he feels he has lost the respect and status he once had. Unsure of what comes next, he has a choice to make.</w:t>
+      </w:r>
+    </w:p>
+    <w:p>
+      <w:pPr>
+        <w:spacing w:before="360" w:after="40"/>
+      </w:pPr>
+      <w:r>
+        <w:rPr>
+          <w:b/>
+          <w:color w:val="B0861A"/>
+          <w:sz w:val="28"/>
+        </w:rPr>
+        <w:t>Screen 06 — The behaviour under pressure</w:t>
+      </w:r>
+    </w:p>
+    <w:p>
+      <w:pPr>
+        <w:spacing w:before="120" w:after="60"/>
+        <w:ind w:left="200"/>
+        <w:shd w:val="clear" w:color="auto" w:fill="F3F1EB"/>
+      </w:pPr>
+      <w:r>
+        <w:rPr>
+          <w:b/>
+          <w:color w:val="554D40"/>
+          <w:sz w:val="19"/>
+        </w:rPr>
+        <w:t xml:space="preserve">Current:  </w:t>
+      </w:r>
+      <w:r>
+        <w:rPr>
+          <w:i/>
+          <w:color w:val="554D40"/>
+          <w:sz w:val="19"/>
+        </w:rPr>
+        <w:t>There is no perfect answer. These are realistic — but unhealthy — ways a person under stress can act. Choosing one does not make it right; seeing what it does to the family helps us understand, not judge.</w:t>
+      </w:r>
+    </w:p>
+    <w:p>
+      <w:pPr>
+        <w:spacing w:before="40" w:after="120"/>
+        <w:ind w:left="200"/>
+        <w:shd w:val="clear" w:color="auto" w:fill="EFF6EF"/>
+      </w:pPr>
+      <w:r>
+        <w:rPr>
+          <w:b/>
+          <w:color w:val="1E7A3C"/>
+          <w:sz w:val="19"/>
+        </w:rPr>
+        <w:t xml:space="preserve">Ali’s suggestion:  </w:t>
+      </w:r>
+      <w:r>
+        <w:rPr>
+          <w:color w:val="2A1F10"/>
+          <w:sz w:val="19"/>
+        </w:rPr>
+        <w:t>People under stress do not always make healthy choices. Explore the consequences to understand, not judge.</w:t>
+      </w:r>
+    </w:p>
+    <w:p>
+      <w:pPr>
+        <w:spacing w:after="120" w:before="40"/>
+      </w:pPr>
+      <w:r>
+        <w:rPr>
+          <w:b w:val="0"/>
+          <w:i/>
+          <w:color w:val="554D40"/>
+          <w:sz w:val="21"/>
+        </w:rPr>
+        <w:t>Note: this is the intro line above the options — it sits alongside whatever gets decided for the multi-select + colour-coded outcomes in Part 1, Screen 06.</w:t>
+      </w:r>
+    </w:p>
+    <w:p>
+      <w:pPr>
+        <w:spacing w:before="360" w:after="40"/>
+      </w:pPr>
+      <w:r>
+        <w:rPr>
+          <w:b/>
+          <w:color w:val="B0861A"/>
+          <w:sz w:val="28"/>
+        </w:rPr>
+        <w:t>Screen 07 — Family experiences</w:t>
+      </w:r>
+    </w:p>
+    <w:p>
+      <w:pPr>
+        <w:spacing w:before="120" w:after="60"/>
+        <w:ind w:left="200"/>
+        <w:shd w:val="clear" w:color="auto" w:fill="F3F1EB"/>
+      </w:pPr>
+      <w:r>
+        <w:rPr>
+          <w:b/>
+          <w:color w:val="554D40"/>
+          <w:sz w:val="19"/>
+        </w:rPr>
+        <w:t xml:space="preserve">Current:  </w:t>
+      </w:r>
+      <w:r>
+        <w:rPr>
+          <w:i/>
+          <w:color w:val="554D40"/>
+          <w:sz w:val="19"/>
+        </w:rPr>
+        <w:t>His partner feels stressed and not heard. The children feel worried, grow quiet, and pull away. This is a response to Orion’s behaviour — his own actions are shaping how his family feels. It is not their fault, and not the pressure itself. He does not fully see it yet. But behaviour can be changed — and that is where the story can turn.</w:t>
+      </w:r>
+    </w:p>
+    <w:p>
+      <w:pPr>
+        <w:spacing w:before="40" w:after="120"/>
+        <w:ind w:left="200"/>
+        <w:shd w:val="clear" w:color="auto" w:fill="EFF6EF"/>
+      </w:pPr>
+      <w:r>
+        <w:rPr>
+          <w:b/>
+          <w:color w:val="1E7A3C"/>
+          <w:sz w:val="19"/>
+        </w:rPr>
+        <w:t xml:space="preserve">Ali’s suggestion:  </w:t>
+      </w:r>
+      <w:r>
+        <w:rPr>
+          <w:color w:val="2A1F10"/>
+          <w:sz w:val="19"/>
+        </w:rPr>
+        <w:t>Orion’s partner feels unheard. The children are worried and pull away. His actions are affecting the family more than he realises. But change is still possible.</w:t>
+      </w:r>
+    </w:p>
+    <w:p>
+      <w:pPr>
+        <w:spacing w:before="360" w:after="40"/>
+      </w:pPr>
+      <w:r>
+        <w:rPr>
+          <w:b/>
+          <w:color w:val="B0861A"/>
+          <w:sz w:val="28"/>
+        </w:rPr>
+        <w:t>Screen 08 — The belief underneath</w:t>
+      </w:r>
+    </w:p>
+    <w:p>
+      <w:pPr>
+        <w:spacing w:before="120" w:after="60"/>
+        <w:ind w:left="200"/>
+        <w:shd w:val="clear" w:color="auto" w:fill="F3F1EB"/>
+      </w:pPr>
+      <w:r>
+        <w:rPr>
+          <w:b/>
+          <w:color w:val="554D40"/>
+          <w:sz w:val="19"/>
+        </w:rPr>
+        <w:t xml:space="preserve">Current:  </w:t>
+      </w:r>
+      <w:r>
+        <w:rPr>
+          <w:i/>
+          <w:color w:val="554D40"/>
+          <w:sz w:val="19"/>
+        </w:rPr>
+        <w:t>Beliefs shape how we act under pressure. The pressures stay the same — but the belief behind our choices shapes how we respond. Which one fits best? There is no wrong choice.</w:t>
+      </w:r>
+    </w:p>
+    <w:p>
+      <w:pPr>
+        <w:spacing w:before="40" w:after="120"/>
+        <w:ind w:left="200"/>
+        <w:shd w:val="clear" w:color="auto" w:fill="EFF6EF"/>
+      </w:pPr>
+      <w:r>
+        <w:rPr>
+          <w:b/>
+          <w:color w:val="1E7A3C"/>
+          <w:sz w:val="19"/>
+        </w:rPr>
+        <w:t xml:space="preserve">Ali’s suggestion:  </w:t>
+      </w:r>
+      <w:r>
+        <w:rPr>
+          <w:color w:val="2A1F10"/>
+          <w:sz w:val="19"/>
+        </w:rPr>
+        <w:t>Beliefs shape how we respond to pressure. The challenges are the same, but different beliefs can lead to different choices. Which one fits best? There is no wrong answer.</w:t>
+      </w:r>
+    </w:p>
+    <w:p>
+      <w:pPr>
+        <w:spacing w:after="120" w:before="40"/>
+      </w:pPr>
+      <w:r>
+        <w:rPr>
+          <w:b w:val="0"/>
+          <w:i/>
+          <w:color w:val="554D40"/>
+          <w:sz w:val="21"/>
+        </w:rPr>
+        <w:t>Ali also flagged the heading itself — "What belief might sit behind this?" — as reading better in the plural ("What beliefs..."), since there are several to choose from. Worth a quick confirm since it’s a matter of preference either way, not a correction.</w:t>
+      </w:r>
+    </w:p>
+    <w:p>
+      <w:pPr>
+        <w:spacing w:before="360" w:after="40"/>
+      </w:pPr>
+      <w:r>
+        <w:rPr>
+          <w:b/>
+          <w:color w:val="B0861A"/>
+          <w:sz w:val="28"/>
+        </w:rPr>
+        <w:t>Screen 09 — The whole tree</w:t>
+      </w:r>
+    </w:p>
+    <w:p>
+      <w:pPr>
+        <w:spacing w:before="120" w:after="60"/>
+        <w:ind w:left="200"/>
+        <w:shd w:val="clear" w:color="auto" w:fill="F3F1EB"/>
+      </w:pPr>
+      <w:r>
+        <w:rPr>
+          <w:b/>
+          <w:color w:val="554D40"/>
+          <w:sz w:val="19"/>
+        </w:rPr>
+        <w:t xml:space="preserve">Current:  </w:t>
+      </w:r>
+      <w:r>
+        <w:rPr>
+          <w:i/>
+          <w:color w:val="554D40"/>
+          <w:sz w:val="19"/>
+        </w:rPr>
+        <w:t>Deep down are two big pressures: migration stress and loss of status. Since 2023: a new language, no work, few connections. He was a leader; now he feels unseen. Think of a tree. The roots are life pressures. The soil is beliefs. The trunk is behaviour. The branches are the impact on family. Our values and beliefs shape how we think, which shapes how we act, which affects the people around us. To make change, we look at the whole tree. We can keep our values and show them in a healthier way — not just change the behaviour.</w:t>
+      </w:r>
+    </w:p>
+    <w:p>
+      <w:pPr>
+        <w:spacing w:before="40" w:after="120"/>
+        <w:ind w:left="200"/>
+        <w:shd w:val="clear" w:color="auto" w:fill="EFF6EF"/>
+      </w:pPr>
+      <w:r>
+        <w:rPr>
+          <w:b/>
+          <w:color w:val="1E7A3C"/>
+          <w:sz w:val="19"/>
+        </w:rPr>
+        <w:t xml:space="preserve">Ali’s suggestion:  </w:t>
+      </w:r>
+      <w:r>
+        <w:rPr>
+          <w:color w:val="2A1F10"/>
+          <w:sz w:val="19"/>
+        </w:rPr>
+        <w:t>Orion is carrying two heavy challenges: adapting to a new life and losing the status he once had. Think of it like a tree: pressures are the roots, beliefs are the soil, actions are the trunk, and family impacts are the branches. Real change comes from understanding the whole tree and finding healthier ways to live our values.</w:t>
+      </w:r>
+    </w:p>
+    <w:p>
+      <w:pPr>
+        <w:spacing w:after="120" w:before="40"/>
+      </w:pPr>
+      <w:r>
+        <w:rPr>
+          <w:b w:val="0"/>
+          <w:i/>
+          <w:color w:val="554D40"/>
+          <w:sz w:val="21"/>
+        </w:rPr>
+        <w:t>Drops the specific "Since 2023..." callback to when Orion arrived. Keeps the full roots/soil/trunk/branches mapping, just more concisely.</w:t>
+      </w:r>
+    </w:p>
+    <w:p>
+      <w:pPr>
+        <w:spacing w:before="360" w:after="40"/>
+      </w:pPr>
+      <w:r>
+        <w:rPr>
+          <w:b/>
+          <w:color w:val="B0861A"/>
+          <w:sz w:val="28"/>
+        </w:rPr>
+        <w:t>Screen 13 — The family feels the change</w:t>
+      </w:r>
+    </w:p>
+    <w:p>
+      <w:pPr>
+        <w:spacing w:before="120" w:after="60"/>
+        <w:ind w:left="200"/>
+        <w:shd w:val="clear" w:color="auto" w:fill="F3F1EB"/>
+      </w:pPr>
+      <w:r>
+        <w:rPr>
+          <w:b/>
+          <w:color w:val="554D40"/>
+          <w:sz w:val="19"/>
+        </w:rPr>
+        <w:t xml:space="preserve">Current:  </w:t>
+      </w:r>
+      <w:r>
+        <w:rPr>
+          <w:i/>
+          <w:color w:val="554D40"/>
+          <w:sz w:val="19"/>
+        </w:rPr>
+        <w:t>When Orion shares power and asks for help, the family feels it. His partner feels respected and can follow her goals. The children feel safe and open up. Orion feels calmer and more confident, less alone — closer to his family, and less weighed down by stress.</w:t>
+      </w:r>
+    </w:p>
+    <w:p>
+      <w:pPr>
+        <w:spacing w:before="40" w:after="120"/>
+        <w:ind w:left="200"/>
+        <w:shd w:val="clear" w:color="auto" w:fill="EFF6EF"/>
+      </w:pPr>
+      <w:r>
+        <w:rPr>
+          <w:b/>
+          <w:color w:val="1E7A3C"/>
+          <w:sz w:val="19"/>
+        </w:rPr>
+        <w:t xml:space="preserve">Ali’s suggestion:  </w:t>
+      </w:r>
+      <w:r>
+        <w:rPr>
+          <w:color w:val="2A1F10"/>
+          <w:sz w:val="19"/>
+        </w:rPr>
+        <w:t>When Orion shares decision making and asks for help, things begin to change. His partner feels respected. The children feel safe and open up. Orion feels calmer, more connected, and less alone.</w:t>
+      </w:r>
+    </w:p>
+    <w:p>
+      <w:pPr>
+        <w:spacing w:before="360" w:after="40"/>
+      </w:pPr>
+      <w:r>
+        <w:rPr>
+          <w:b/>
+          <w:color w:val="B0861A"/>
+          <w:sz w:val="28"/>
+        </w:rPr>
+        <w:t>Screen 15 — A tree that is healing</w:t>
+      </w:r>
+    </w:p>
+    <w:p>
+      <w:pPr>
+        <w:spacing w:before="120" w:after="60"/>
+        <w:ind w:left="200"/>
+        <w:shd w:val="clear" w:color="auto" w:fill="F3F1EB"/>
+      </w:pPr>
+      <w:r>
+        <w:rPr>
+          <w:b/>
+          <w:color w:val="554D40"/>
+          <w:sz w:val="19"/>
+        </w:rPr>
+        <w:t xml:space="preserve">Current:  </w:t>
+      </w:r>
+      <w:r>
+        <w:rPr>
+          <w:i/>
+          <w:color w:val="554D40"/>
+          <w:sz w:val="19"/>
+        </w:rPr>
+        <w:t>Some things got better, and some strain remains. A few choices kept the power with Orion alone. But he is trying, and the tree is greener than before. Change is a journey — even small steps make a real difference. Positive change does not need big actions.</w:t>
+      </w:r>
+    </w:p>
+    <w:p>
+      <w:pPr>
+        <w:spacing w:before="40" w:after="120"/>
+        <w:ind w:left="200"/>
+        <w:shd w:val="clear" w:color="auto" w:fill="EFF6EF"/>
+      </w:pPr>
+      <w:r>
+        <w:rPr>
+          <w:b/>
+          <w:color w:val="1E7A3C"/>
+          <w:sz w:val="19"/>
+        </w:rPr>
+        <w:t xml:space="preserve">Ali’s suggestion:  </w:t>
+      </w:r>
+      <w:r>
+        <w:rPr>
+          <w:color w:val="2A1F10"/>
+          <w:sz w:val="19"/>
+        </w:rPr>
+        <w:t>Some things improved, while other challenges remained. Orion still held onto some control, but he was trying to change. Change is a journey, and even small steps can make a real difference.</w:t>
+      </w:r>
+    </w:p>
+    <w:p>
+      <w:pPr>
+        <w:spacing w:before="360" w:after="40"/>
+      </w:pPr>
+      <w:r>
+        <w:rPr>
+          <w:b/>
+          <w:color w:val="B0861A"/>
+          <w:sz w:val="28"/>
+        </w:rPr>
+        <w:t>Screen 20 — What we learn</w:t>
+      </w:r>
+    </w:p>
+    <w:p>
+      <w:pPr>
+        <w:spacing w:before="120" w:after="60"/>
+        <w:ind w:left="200"/>
+        <w:shd w:val="clear" w:color="auto" w:fill="F3F1EB"/>
+      </w:pPr>
+      <w:r>
+        <w:rPr>
+          <w:b/>
+          <w:color w:val="554D40"/>
+          <w:sz w:val="19"/>
+        </w:rPr>
+        <w:t xml:space="preserve">Current:  </w:t>
+      </w:r>
+      <w:r>
+        <w:rPr>
+          <w:i/>
+          <w:color w:val="554D40"/>
+          <w:sz w:val="19"/>
+        </w:rPr>
+        <w:t>By changing his beliefs, Orion can change his actions — and build a safe, respectful home. Ask yourself: 🌱 Which belief is worth changing first? 🌿 What helps most when the pressure is high? 🌳 What does trust look like at home? 🍎 What home do we want for our family?</w:t>
+      </w:r>
+    </w:p>
+    <w:p>
+      <w:pPr>
+        <w:spacing w:before="40" w:after="120"/>
+        <w:ind w:left="200"/>
+        <w:shd w:val="clear" w:color="auto" w:fill="EFF6EF"/>
+      </w:pPr>
+      <w:r>
+        <w:rPr>
+          <w:b/>
+          <w:color w:val="1E7A3C"/>
+          <w:sz w:val="19"/>
+        </w:rPr>
+        <w:t xml:space="preserve">Ali’s suggestion:  </w:t>
+      </w:r>
+      <w:r>
+        <w:rPr>
+          <w:color w:val="2A1F10"/>
+          <w:sz w:val="19"/>
+        </w:rPr>
+        <w:t>Changing beliefs can lead to healthier choices and stronger relationships. Take a moment to reflect and ask yourself: 🌱 Which belief is worth changing first? 🌿 What helps most under pressure? 🌳 What does trust look like at home? 🍎 What kind of home do we want for our family?</w:t>
+      </w:r>
+    </w:p>
+    <w:p>
+      <w:pPr>
+        <w:spacing w:before="360" w:after="40"/>
+      </w:pPr>
+      <w:r>
+        <w:rPr>
+          <w:b/>
+          <w:color w:val="B0861A"/>
+          <w:sz w:val="28"/>
+        </w:rPr>
+        <w:t>Screen 12 — Orion’s action — one option’s feedback text</w:t>
+      </w:r>
+    </w:p>
+    <w:p>
+      <w:pPr>
+        <w:spacing w:after="120" w:before="40"/>
+      </w:pPr>
+      <w:r>
+        <w:rPr>
+          <w:b w:val="0"/>
+          <w:i/>
+          <w:color w:val="554D40"/>
+          <w:sz w:val="21"/>
+        </w:rPr>
+        <w:t>Ali flagged just the feedback for "Keep control, but try to be kinder about it" specifically, not the whole screen.</w:t>
+      </w:r>
+    </w:p>
+    <w:p>
+      <w:pPr>
+        <w:spacing w:before="120" w:after="60"/>
+        <w:ind w:left="200"/>
+        <w:shd w:val="clear" w:color="auto" w:fill="F3F1EB"/>
+      </w:pPr>
+      <w:r>
+        <w:rPr>
+          <w:b/>
+          <w:color w:val="554D40"/>
+          <w:sz w:val="19"/>
+        </w:rPr>
+        <w:t xml:space="preserve">Current:  </w:t>
+      </w:r>
+      <w:r>
+        <w:rPr>
+          <w:i/>
+          <w:color w:val="554D40"/>
+          <w:sz w:val="19"/>
+        </w:rPr>
+        <w:t>Kindness helps. But keeping all the power to himself does not really heal the tree. Sharing it does.</w:t>
+      </w:r>
+    </w:p>
+    <w:p>
+      <w:pPr>
+        <w:spacing w:before="40" w:after="120"/>
+        <w:ind w:left="200"/>
+        <w:shd w:val="clear" w:color="auto" w:fill="EFF6EF"/>
+      </w:pPr>
+      <w:r>
+        <w:rPr>
+          <w:b/>
+          <w:color w:val="1E7A3C"/>
+          <w:sz w:val="19"/>
+        </w:rPr>
+        <w:t xml:space="preserve">Ali’s suggestion:  </w:t>
+      </w:r>
+      <w:r>
+        <w:rPr>
+          <w:color w:val="2A1F10"/>
+          <w:sz w:val="19"/>
+        </w:rPr>
+        <w:t>Controlling the decisions in the family does not heal the tree even if he is kind.</w:t>
+      </w:r>
+    </w:p>
+    <w:p>
+      <w:pPr>
+        <w:spacing w:before="120" w:after="120"/>
+      </w:pPr>
+      <w:r>
+        <w:rPr>
+          <w:color w:val="CCC4B6"/>
+        </w:rPr>
+        <w:t>____________________________________________________________</w:t>
+      </w:r>
+    </w:p>
+    <w:p>
+      <w:pPr>
+        <w:spacing w:before="280" w:after="80"/>
+      </w:pPr>
+      <w:r>
+        <w:rPr>
+          <w:b/>
+          <w:color w:val="B0861A"/>
+          <w:sz w:val="26"/>
+        </w:rPr>
+        <w:t>Suggested order to tackle all of this</w:t>
+      </w:r>
+    </w:p>
+    <w:p>
+      <w:pPr>
+        <w:pStyle w:val="ListBullet"/>
+        <w:spacing w:after="60"/>
+      </w:pPr>
+      <w:r>
+        <w:t>Confirm the support-line placement with Anu/PVAW first — it’s the one item here with real safety weight, alongside the multi-select decision from Part 1.</w:t>
+      </w:r>
+    </w:p>
+    <w:p>
+      <w:pPr>
+        <w:pStyle w:val="ListBullet"/>
+        <w:spacing w:after="60"/>
+      </w:pPr>
+      <w:r>
+        <w:t>The screen-by-screen text trims (Part 2, section 3) are low-risk copy swaps and could be applied any time once you’re happy with the wording — they don’t depend on any other decision.</w:t>
+      </w:r>
+    </w:p>
+    <w:p>
+      <w:pPr>
+        <w:pStyle w:val="ListBullet"/>
+        <w:spacing w:after="60"/>
+      </w:pPr>
+      <w:r>
+        <w:t>The "one title per screen" change touches every screen’s layout, so worth doing in the same pass as the text trims rather than separately.</w:t>
+      </w:r>
+    </w:p>
+    <w:p>
+      <w:pPr>
+        <w:pStyle w:val="ListBullet"/>
+        <w:spacing w:after="60"/>
+      </w:pPr>
+      <w:r>
+        <w:t>Fold both into the same round of screen changes as the Part 1 items where they overlap (e.g. Screen 06’s intro line, Screen 07/13’s wording) — rather than editing the same screen twice.</w:t>
+      </w:r>
+    </w:p>
+    <w:p>
+      <w:pPr>
+        <w:spacing w:before="280"/>
+      </w:pPr>
+      <w:r>
+        <w:rPr>
+          <w:i/>
+          <w:color w:val="554D40"/>
+          <w:sz w:val="19"/>
+        </w:rPr>
+        <w:t>Once the support-line question and the two Part 1 scoring/design decisions are settled, everything else here — the text trims, the title consolidation, and the small/medium Part 1 screens — can be built together in one pass. Screen 13’s new branches drag-and-drop stays a separate, content-led follow-up.</w:t>
       </w:r>
     </w:p>
     <w:sectPr>

</xml_diff>

<commit_message>
Remove dashes from the proposed-changes document's own prose
Reworded headings, notes, tags and effort labels in
Shaping-Change-Proposed-Changes-Anu.docx to use colons, semicolons
or restructured sentences instead of em dashes. Left dashes intact
inside verbatim quotes (Ali's own comment text, and the "Current:"
blocks quoting the actual existing game copy), since editing those
would misrepresent what they're quoting.

Co-Authored-By: Claude Sonnet 5 <noreply@anthropic.com>
</commit_message>
<xml_diff>
--- a/docs/Shaping-Change-Proposed-Changes-Anu.docx
+++ b/docs/Shaping-Change-Proposed-Changes-Anu.docx
@@ -23,7 +23,7 @@
           <w:color w:val="B0861A"/>
           <w:sz w:val="28"/>
         </w:rPr>
-        <w:t>Proposed Changes — Anu’s Feedback &amp; Ali’s Text Suggestions</w:t>
+        <w:t>Proposed Changes: Anu’s Feedback &amp; Ali’s Text Suggestions</w:t>
       </w:r>
     </w:p>
     <w:p>
@@ -37,7 +37,7 @@
           <w:color w:val="554D40"/>
           <w:sz w:val="21"/>
         </w:rPr>
-        <w:t>Part 1 is a screen-by-screen proposal for what the multi-select and related changes would actually involve, based on Anu’s replies (17 September 2026) to Oleksandra’s comments. Part 2 covers Ali’s suggestions for cutting down on-screen text, from "Suggestions to the game.docx" (17 September 2026). This is a planning document, not a build — nothing here has been implemented yet.</w:t>
+        <w:t>Part 1 is a screen-by-screen proposal for what the multi-select and related changes would actually involve, based on Anu’s replies (17 September 2026) to Oleksandra’s comments. Part 2 covers Ali’s suggestions for cutting down on-screen text, from "Suggestions to the game.docx" (17 September 2026). This is a planning document, not a build; nothing here has been implemented yet.</w:t>
       </w:r>
     </w:p>
     <w:p>
@@ -61,7 +61,7 @@
           <w:color w:val="2A1F10"/>
           <w:sz w:val="32"/>
         </w:rPr>
-        <w:t>Part 1 — Anu’s feedback on Oleksandra’s comments</w:t>
+        <w:t>Part 1: Anu’s feedback on Oleksandra’s comments</w:t>
       </w:r>
     </w:p>
     <w:p>
@@ -109,7 +109,7 @@
         <w:rPr>
           <w:sz w:val="21"/>
         </w:rPr>
-        <w:t xml:space="preserve"> — verified down to a 320px-wide phone. This matters a lot for multi-select specifically, because several of these screens currently show one paragraph of "reasoning" text per option, and that text only appears for the ONE option a learner picks.</w:t>
+        <w:t>. This has been verified down to a 320px-wide phone, and it matters a lot for multi-select specifically, because several of these screens currently show one paragraph of "reasoning" text per option, and that text only appears for the ONE option a learner picks.</w:t>
       </w:r>
     </w:p>
     <w:p>
@@ -122,7 +122,7 @@
           <w:i w:val="0"/>
           <w:sz w:val="21"/>
         </w:rPr>
-        <w:t>If a learner can now select several options at once, and we show the reasoning/outcome text for every one they picked, that could be 3–5 paragraphs stacked in the same panel that used to hold one. On the two screens with the most options (belief, with 5 choices) and the busiest text (behaviour, with the new colour-coded outcomes Anu asked for), this could break the no-scroll rule on smaller phones.</w:t>
+        <w:t>If a learner can now select several options at once, and we show the reasoning/outcome text for every one they picked, that could be 3 to 5 paragraphs stacked in the same panel that used to hold one. On the two screens with the most options (belief, with 5 choices) and the busiest text (behaviour, with the new colour-coded outcomes Anu asked for), this could break the no-scroll rule on smaller phones.</w:t>
       </w:r>
     </w:p>
     <w:p>
@@ -153,7 +153,7 @@
         <w:spacing w:after="60"/>
       </w:pPr>
       <w:r>
-        <w:t>Show a short one-line outcome tag per selected option (not the full paragraph), with the full reasoning only for the last one selected — a middle ground.</w:t>
+        <w:t>Show a short one-line outcome tag per selected option (not the full paragraph), with the full reasoning only for the last one selected, as a middle ground.</w:t>
       </w:r>
     </w:p>
     <w:p>
@@ -162,7 +162,7 @@
         <w:spacing w:after="60"/>
       </w:pPr>
       <w:r>
-        <w:t>Let the reasoning area scroll internally while the rest of the panel (question, options, Continue) stays fixed — the one place we’d deliberately break the "never scroll" rule, and only in a small contained area.</w:t>
+        <w:t>Let the reasoning area scroll internally while the rest of the panel (question, options, Continue) stays fixed. This would be the one place we’d deliberately break the "never scroll" rule, and only in a small contained area.</w:t>
       </w:r>
     </w:p>
     <w:p>
@@ -200,7 +200,7 @@
           <w:color w:val="B0861A"/>
           <w:sz w:val="28"/>
         </w:rPr>
-        <w:t>Screen 06 — Money worries → Behaviour under pressure (Slide 9)</w:t>
+        <w:t>Screen 06: Money worries → Behaviour under pressure (Slide 9)</w:t>
       </w:r>
     </w:p>
     <w:p>
@@ -246,7 +246,7 @@
         <w:spacing w:after="60"/>
       </w:pPr>
       <w:r>
-        <w:t>The three options become multi-select — pills stay pressed once tapped, and accumulate.</w:t>
+        <w:t>The three options become multi-select: pills stay pressed once tapped, and accumulate.</w:t>
       </w:r>
     </w:p>
     <w:p>
@@ -264,7 +264,7 @@
         <w:spacing w:after="60"/>
       </w:pPr>
       <w:r>
-        <w:t>Take tight control → "Family feels stifled."</w:t>
+        <w:t>Take tight control: "Family feels stifled."</w:t>
       </w:r>
     </w:p>
     <w:p>
@@ -273,7 +273,7 @@
         <w:spacing w:after="60"/>
       </w:pPr>
       <w:r>
-        <w:t>Go quiet and pull away → "Impacts Orion’s own mental health."</w:t>
+        <w:t>Go quiet and pull away: "Impacts Orion’s own mental health."</w:t>
       </w:r>
     </w:p>
     <w:p>
@@ -282,7 +282,7 @@
         <w:spacing w:after="60"/>
       </w:pPr>
       <w:r>
-        <w:t>Anger and blame → "The family can be hurt by it."</w:t>
+        <w:t>Anger and blame: "The family can be hurt by it."</w:t>
       </w:r>
     </w:p>
     <w:p>
@@ -317,7 +317,7 @@
           <w:i w:val="0"/>
           <w:sz w:val="21"/>
         </w:rPr>
-        <w:t>All three options currently reduce the tree’s health by a similar amount when picked alone (–18 to –20). If a learner selects two or three of them together, does the health penalty stack (each one applies), or should it cap at the single worst option’s penalty? Stacking is more realistic (more harmful choices = more harm) but could push the tree toward the "damaged" outcome very quickly if someone selects all three just to read the feedback, which may not reflect what they’d actually do. Recommend capping at the worst-selected option’s penalty, so exploring options out of curiosity isn’t punished harder than committing to the single worst one — but this is a pedagogy call, not a dev one.</w:t>
+        <w:t>All three options currently reduce the tree’s health by a similar amount when picked alone (around 18 to 20 points). If a learner selects two or three of them together, does the health penalty stack (each one applies), or should it cap at the single worst option’s penalty? Stacking is more realistic (more harmful choices means more harm) but could push the tree toward the "damaged" outcome very quickly if someone selects all three just to read the feedback, which may not reflect what they’d actually do. Recommend capping at the worst-selected option’s penalty, so exploring options out of curiosity isn’t punished harder than committing to the single worst one. That said, this is a pedagogy call, not a dev one.</w:t>
       </w:r>
     </w:p>
     <w:p>
@@ -338,7 +338,7 @@
           <w:color w:val="B0861A"/>
           <w:sz w:val="19"/>
         </w:rPr>
-        <w:t>Medium — new multi-select interaction, new copy (already supplied by Anu), one scoring decision.</w:t>
+        <w:t>Medium: new multi-select interaction, new copy (already supplied by Anu), one scoring decision.</w:t>
       </w:r>
     </w:p>
     <w:p>
@@ -362,7 +362,7 @@
           <w:color w:val="B0861A"/>
           <w:sz w:val="28"/>
         </w:rPr>
-        <w:t>Screen 08 — The belief underneath (Slide 11)</w:t>
+        <w:t>Screen 08: The belief underneath (Slide 11)</w:t>
       </w:r>
     </w:p>
     <w:p>
@@ -417,7 +417,7 @@
         <w:spacing w:after="60"/>
       </w:pPr>
       <w:r>
-        <w:t>No colour-coded outcomes needed here — Anu didn’t flag differing outcomes for this screen, and all options already lead to the same next screen with fx.health: 0 (no scoring impact either way).</w:t>
+        <w:t>No colour-coded outcomes needed here: Anu didn’t flag differing outcomes for this screen, and all options already lead to the same next screen with fx.health: 0 (no scoring impact either way).</w:t>
       </w:r>
     </w:p>
     <w:p>
@@ -426,7 +426,7 @@
         <w:spacing w:after="60"/>
       </w:pPr>
       <w:r>
-        <w:t>Simplest of the multi-select changes — no scoring conflict, since none of these options affects health.</w:t>
+        <w:t>Simplest of the multi-select changes: no scoring conflict, since none of these options affects health.</w:t>
       </w:r>
     </w:p>
     <w:p>
@@ -447,7 +447,7 @@
           <w:color w:val="1E7A3C"/>
           <w:sz w:val="19"/>
         </w:rPr>
-        <w:t>Small — same mechanic as Screen 06, no scoring question, no new copy needed.</w:t>
+        <w:t>Small: same mechanic as Screen 06, no scoring question, no new copy needed.</w:t>
       </w:r>
     </w:p>
     <w:p>
@@ -471,7 +471,7 @@
           <w:color w:val="B0861A"/>
           <w:sz w:val="28"/>
         </w:rPr>
-        <w:t>Screen 11 — A healthier belief / soil (Slide 14)</w:t>
+        <w:t>Screen 11: A healthier belief / soil (Slide 14)</w:t>
       </w:r>
     </w:p>
     <w:p>
@@ -526,7 +526,7 @@
         <w:spacing w:after="60"/>
       </w:pPr>
       <w:r>
-        <w:t>Soil drop zone — already fixed and live (this was actioned in the round before Anu’s reply); no further work needed.</w:t>
+        <w:t>Soil drop zone: already fixed and live (this was actioned in the round before Anu’s reply); no further work needed.</w:t>
       </w:r>
     </w:p>
     <w:p>
@@ -535,7 +535,7 @@
         <w:spacing w:after="60"/>
       </w:pPr>
       <w:r>
-        <w:t>Orion’s expression: after the FIRST healthy option is dropped, his expression shifts to visibly less sad — a new engine feature (his mood currently only follows the overall health score, not a live in-screen reaction to a single choice).</w:t>
+        <w:t>Orion’s expression: after the FIRST healthy option is dropped, his expression shifts to visibly less sad. This is a new engine feature (his mood currently only follows the overall health score, not a live in-screen reaction to a single choice).</w:t>
       </w:r>
     </w:p>
     <w:p>
@@ -561,7 +561,7 @@
           <w:i w:val="0"/>
           <w:sz w:val="21"/>
         </w:rPr>
-        <w:t>Three of the four options here are healthy (+18 health each) and one is neutral ("I can stay in charge", –2 health). If a learner selects a mix — say two healthy beliefs AND the neutral one — how should that combine? Recommend: any healthy selection counts as healthy overall (the neutral option only applies if it’s the ONLY thing selected), so exploring doesn’t accidentally cancel out a good choice. Same underlying question as Screen 06, just in the opposite direction (mixing helps here, hurts there).</w:t>
+        <w:t>Three of the four options here are healthy (plus 18 health each) and one is neutral ("I can stay in charge", minus 2 health). If a learner selects a mix, say two healthy beliefs and the neutral one, how should that combine? Recommend: any healthy selection counts as healthy overall (the neutral option only applies if it’s the ONLY thing selected), so exploring doesn’t accidentally cancel out a good choice. It’s the same underlying question as Screen 06, just in the opposite direction (mixing helps here, hurts there).</w:t>
       </w:r>
     </w:p>
     <w:p>
@@ -582,7 +582,7 @@
           <w:color w:val="B0861A"/>
           <w:sz w:val="19"/>
         </w:rPr>
-        <w:t>Medium-Large — multi-select drag-and-drop (a new pattern, since the existing drag mechanic assumes a single selection), plus a new progressive-expression feature.</w:t>
+        <w:t>Medium to Large: multi-select drag-and-drop (a new pattern, since the existing drag mechanic assumes a single selection), plus a new progressive-expression feature.</w:t>
       </w:r>
     </w:p>
     <w:p>
@@ -606,7 +606,7 @@
           <w:color w:val="B0861A"/>
           <w:sz w:val="28"/>
         </w:rPr>
-        <w:t>Screen 12 — Orion’s action / trunk (Slide 15)</w:t>
+        <w:t>Screen 12: Orion’s action / trunk (Slide 15)</w:t>
       </w:r>
     </w:p>
     <w:p>
@@ -661,7 +661,7 @@
         <w:spacing w:after="60"/>
       </w:pPr>
       <w:r>
-        <w:t>A new immediate visual cue the moment a HEALTHY option is dropped — consistent with the soil-watering effect, applied to the trunk (e.g. a brief glow/strengthen pulse on the trunk).</w:t>
+        <w:t>A new immediate visual cue the moment a HEALTHY option is dropped, consistent with the soil-watering effect, applied to the trunk (e.g. a brief glow/strengthen pulse on the trunk).</w:t>
       </w:r>
     </w:p>
     <w:p>
@@ -675,7 +675,7 @@
           <w:color w:val="554D40"/>
           <w:sz w:val="21"/>
         </w:rPr>
-        <w:t>Same scoring question as Screen 11 applies here too (two healthy options + one neutral "keep control but kinder").</w:t>
+        <w:t>Same scoring question as Screen 11 applies here too (two healthy options plus one neutral "keep control but kinder").</w:t>
       </w:r>
     </w:p>
     <w:p>
@@ -696,7 +696,7 @@
           <w:color w:val="B0861A"/>
           <w:sz w:val="19"/>
         </w:rPr>
-        <w:t>Medium — same multi-select drag-and-drop pattern as Screen 11, plus one new visual cue (smaller than the expression feature).</w:t>
+        <w:t>Medium: same multi-select drag-and-drop pattern as Screen 11, plus one new visual cue (smaller than the expression feature).</w:t>
       </w:r>
     </w:p>
     <w:p>
@@ -720,7 +720,7 @@
           <w:color w:val="B0861A"/>
           <w:sz w:val="28"/>
         </w:rPr>
-        <w:t>Screen 13 — The family feels the change / branches (Slide 16)</w:t>
+        <w:t>Screen 13: The family feels the change / branches (Slide 16)</w:t>
       </w:r>
     </w:p>
     <w:p>
@@ -766,7 +766,7 @@
         <w:spacing w:after="60"/>
       </w:pPr>
       <w:r>
-        <w:t>This is a genuinely new mechanic, not a tweak — this screen currently just narrates the outcome (no choices at all). Turning it into a third drag-and-drop means: new draggable option content (what specific "family wellbeing" actions would a learner choose from?), wiring the engine to accept the "branches" area as a drop target, and a new visual — the branches visibly flourishing (extra leaves, colour, maybe early fruit) as it’s dropped.</w:t>
+        <w:t>This is a genuinely new mechanic, not a tweak: this screen currently just narrates the outcome (no choices at all). Turning it into a third drag-and-drop means: new draggable option content (what specific "family wellbeing" actions would a learner choose from?), wiring the engine to accept the "branches" area as a drop target, and a new visual: the branches visibly flourishing (extra leaves, colour, maybe early fruit) as it’s dropped.</w:t>
       </w:r>
     </w:p>
     <w:p>
@@ -792,7 +792,7 @@
           <w:i w:val="0"/>
           <w:sz w:val="21"/>
         </w:rPr>
-        <w:t>Anu’s idea is a strong direction, but we’d need 2–3 concrete option choices and their wording before this can be built — e.g. "spend time together," "really listen when they talk," "keep the promise he made." Suggest this goes to the content/Edu side as its own small task, separate from the other four screens (which are ready to build once the scoring questions above are settled).</w:t>
+        <w:t>Anu’s idea is a strong direction, but we’d need two or three concrete option choices and their wording before this can be built, e.g. "spend time together," "really listen when they talk," "keep the promise he made." Suggest this goes to the content/Edu side as its own small task, separate from the other four screens (which are ready to build once the scoring questions above are settled).</w:t>
       </w:r>
     </w:p>
     <w:p>
@@ -813,7 +813,7 @@
           <w:color w:val="B01A1A"/>
           <w:sz w:val="19"/>
         </w:rPr>
-        <w:t>Large — a new mechanic end-to-end (content, drop-target wiring, new visual), and blocked on content before any build work can start.</w:t>
+        <w:t>Large: a new mechanic end-to-end (content, drop-target wiring, new visual), and blocked on content before any build work can start.</w:t>
       </w:r>
     </w:p>
     <w:p>
@@ -837,7 +837,7 @@
           <w:color w:val="B0861A"/>
           <w:sz w:val="28"/>
         </w:rPr>
-        <w:t>Screen 22 — One step you will take (Slide 25)</w:t>
+        <w:t>Screen 22: One step you will take (Slide 25)</w:t>
       </w:r>
     </w:p>
     <w:p>
@@ -892,7 +892,7 @@
         <w:spacing w:after="60"/>
       </w:pPr>
       <w:r>
-        <w:t>Free-text editing stays exactly as it is — this only changes how the suggestion chips behave.</w:t>
+        <w:t>Free-text editing stays exactly as it is; this only changes how the suggestion chips behave.</w:t>
       </w:r>
     </w:p>
     <w:p>
@@ -901,7 +901,7 @@
         <w:spacing w:after="60"/>
       </w:pPr>
       <w:r>
-        <w:t>No scoring question here — the pledge doesn’t affect the tree’s health, so there’s nothing to reconcile.</w:t>
+        <w:t>No scoring question here: the pledge doesn’t affect the tree’s health, so there’s nothing to reconcile.</w:t>
       </w:r>
     </w:p>
     <w:p>
@@ -922,7 +922,7 @@
           <w:color w:val="1E7A3C"/>
           <w:sz w:val="19"/>
         </w:rPr>
-        <w:t>Small — a self-contained UI change, no scoring question, no new copy.</w:t>
+        <w:t>Small: a self-contained UI change, no scoring question, no new copy.</w:t>
       </w:r>
     </w:p>
     <w:p>
@@ -946,7 +946,7 @@
           <w:color w:val="2A1F10"/>
           <w:sz w:val="32"/>
         </w:rPr>
-        <w:t>Part 2 — Ali’s suggestions: cutting down the text</w:t>
+        <w:t>Part 2: Ali’s suggestions on cutting down the text</w:t>
       </w:r>
     </w:p>
     <w:p>
@@ -1010,7 +1010,7 @@
           <w:color w:val="B01A1A"/>
           <w:sz w:val="18"/>
         </w:rPr>
-        <w:t>CONFLICTS WITH AN EXISTING SAFETY GUARDRAIL — NEEDS PVAW SIGN-OFF</w:t>
+        <w:t>CONFLICTS WITH AN EXISTING SAFETY GUARDRAIL: NEEDS PVAW SIGN-OFF</w:t>
       </w:r>
     </w:p>
     <w:p>
@@ -1023,7 +1023,7 @@
           <w:i w:val="0"/>
           <w:sz w:val="21"/>
         </w:rPr>
-        <w:t>This isn’t a copy edit — it reverses a specific, documented pedagogy decision: "the 1800RESPECT / 000 support line shows on every screen," which is checked automatically on every content change (the build fails if any screen is missing it). That rule exists so the support line is always visible without a learner needing to reach the end of the activity. Removing it from every screen but the last is a real safety-design change, not a text-density one, so this needs Anu/PVAW’s explicit confirmation before it happens — the same weight as the multi-select decision in Part 1, not something to fold in quietly alongside the wording trims below.</w:t>
+        <w:t>This isn’t a copy edit. It reverses a specific, documented pedagogy decision: "the 1800RESPECT / 000 support line shows on every screen," which is checked automatically on every content change (the build fails if any screen is missing it). That rule exists so the support line is always visible without a learner needing to reach the end of the activity. Removing it from every screen but the last is a real safety-design change, not a text-density one, so this needs Anu/PVAW’s explicit confirmation before it happens. It carries the same weight as the multi-select decision in Part 1, not something to fold in quietly alongside the wording trims below.</w:t>
       </w:r>
     </w:p>
     <w:p>
@@ -1087,7 +1087,7 @@
           <w:i w:val="0"/>
           <w:sz w:val="21"/>
         </w:rPr>
-        <w:t>Reading this as: keep the step-progress indicator (the dots + "Step X of 10", since that’s orientation, not really a "title") and the actual question/heading — and drop the middle line (the "Phase 1 · ..." tag), which mostly repeats what the heading already says. Worth confirming that’s the intended reading before it’s applied everywhere, since it touches every single screen in the game.</w:t>
+        <w:t>Reading this as: keep the step-progress indicator (the dots plus "Step X of 10", since that’s orientation, not really a "title") and the actual question/heading, and drop the middle line (the "Phase 1 · ..." tag), which mostly repeats what the heading already says. Worth confirming that’s the intended reading before it’s applied everywhere, since it touches every single screen in the game.</w:t>
       </w:r>
     </w:p>
     <w:p>
@@ -1108,7 +1108,7 @@
           <w:color w:val="1E7A3C"/>
           <w:sz w:val="19"/>
         </w:rPr>
-        <w:t>Small — a consistent CSS/markup change once the interpretation above is confirmed.</w:t>
+        <w:t>Small: a consistent CSS/markup change once the interpretation above is confirmed.</w:t>
       </w:r>
     </w:p>
     <w:p>
@@ -1135,7 +1135,7 @@
           <w:color w:val="554D40"/>
           <w:sz w:val="21"/>
         </w:rPr>
-        <w:t>Ali’s versions are generally shorter and keep the core teaching point; a couple of specific personal-detail callbacks (e.g. "Since 2023..." on the tree screen) are dropped in the interest of brevity — flagged where that happens, otherwise nothing substantive seems to be lost.</w:t>
+        <w:t>Ali’s versions are generally shorter and keep the core teaching point. A couple of specific personal-detail callbacks (e.g. "Since 2023..." on the tree screen) are dropped in the interest of brevity, flagged where that happens; otherwise nothing substantive seems to be lost.</w:t>
       </w:r>
     </w:p>
     <w:p>
@@ -1148,7 +1148,7 @@
           <w:color w:val="B0861A"/>
           <w:sz w:val="28"/>
         </w:rPr>
-        <w:t>Screen 03 — Money worries</w:t>
+        <w:t>Screen 03: Money worries</w:t>
       </w:r>
     </w:p>
     <w:p>
@@ -1206,7 +1206,7 @@
           <w:color w:val="B0861A"/>
           <w:sz w:val="28"/>
         </w:rPr>
-        <w:t>Screen 04 — A changing role</w:t>
+        <w:t>Screen 04: A changing role</w:t>
       </w:r>
     </w:p>
     <w:p>
@@ -1264,7 +1264,7 @@
           <w:color w:val="B0861A"/>
           <w:sz w:val="28"/>
         </w:rPr>
-        <w:t>Screen 05 — Two big pressures</w:t>
+        <w:t>Screen 05: Two big pressures</w:t>
       </w:r>
     </w:p>
     <w:p>
@@ -1322,7 +1322,7 @@
           <w:color w:val="B0861A"/>
           <w:sz w:val="28"/>
         </w:rPr>
-        <w:t>Screen 06 — The behaviour under pressure</w:t>
+        <w:t>Screen 06: The behaviour under pressure</w:t>
       </w:r>
     </w:p>
     <w:p>
@@ -1381,7 +1381,7 @@
           <w:color w:val="554D40"/>
           <w:sz w:val="21"/>
         </w:rPr>
-        <w:t>Note: this is the intro line above the options — it sits alongside whatever gets decided for the multi-select + colour-coded outcomes in Part 1, Screen 06.</w:t>
+        <w:t>Note: this is the intro line above the options; it sits alongside whatever gets decided for the multi-select and colour-coded outcomes in Part 1, Screen 06.</w:t>
       </w:r>
     </w:p>
     <w:p>
@@ -1394,7 +1394,7 @@
           <w:color w:val="B0861A"/>
           <w:sz w:val="28"/>
         </w:rPr>
-        <w:t>Screen 07 — Family experiences</w:t>
+        <w:t>Screen 07: Family experiences</w:t>
       </w:r>
     </w:p>
     <w:p>
@@ -1452,7 +1452,7 @@
           <w:color w:val="B0861A"/>
           <w:sz w:val="28"/>
         </w:rPr>
-        <w:t>Screen 08 — The belief underneath</w:t>
+        <w:t>Screen 08: The belief underneath</w:t>
       </w:r>
     </w:p>
     <w:p>
@@ -1511,7 +1511,7 @@
           <w:color w:val="554D40"/>
           <w:sz w:val="21"/>
         </w:rPr>
-        <w:t>Ali also flagged the heading itself — "What belief might sit behind this?" — as reading better in the plural ("What beliefs..."), since there are several to choose from. Worth a quick confirm since it’s a matter of preference either way, not a correction.</w:t>
+        <w:t>Ali also flagged the heading itself, "What belief might sit behind this?", as reading better in the plural ("What beliefs..."), since there are several to choose from. Worth a quick confirm since it’s a matter of preference either way, not a correction.</w:t>
       </w:r>
     </w:p>
     <w:p>
@@ -1524,7 +1524,7 @@
           <w:color w:val="B0861A"/>
           <w:sz w:val="28"/>
         </w:rPr>
-        <w:t>Screen 09 — The whole tree</w:t>
+        <w:t>Screen 09: The whole tree</w:t>
       </w:r>
     </w:p>
     <w:p>
@@ -1596,7 +1596,7 @@
           <w:color w:val="B0861A"/>
           <w:sz w:val="28"/>
         </w:rPr>
-        <w:t>Screen 13 — The family feels the change</w:t>
+        <w:t>Screen 13: The family feels the change</w:t>
       </w:r>
     </w:p>
     <w:p>
@@ -1654,7 +1654,7 @@
           <w:color w:val="B0861A"/>
           <w:sz w:val="28"/>
         </w:rPr>
-        <w:t>Screen 15 — A tree that is healing</w:t>
+        <w:t>Screen 15: A tree that is healing</w:t>
       </w:r>
     </w:p>
     <w:p>
@@ -1712,7 +1712,7 @@
           <w:color w:val="B0861A"/>
           <w:sz w:val="28"/>
         </w:rPr>
-        <w:t>Screen 20 — What we learn</w:t>
+        <w:t>Screen 20: What we learn</w:t>
       </w:r>
     </w:p>
     <w:p>
@@ -1770,7 +1770,7 @@
           <w:color w:val="B0861A"/>
           <w:sz w:val="28"/>
         </w:rPr>
-        <w:t>Screen 12 — Orion’s action — one option’s feedback text</w:t>
+        <w:t>Screen 12: Orion’s action: one option’s feedback text</w:t>
       </w:r>
     </w:p>
     <w:p>
@@ -1862,7 +1862,7 @@
         <w:spacing w:after="60"/>
       </w:pPr>
       <w:r>
-        <w:t>Confirm the support-line placement with Anu/PVAW first — it’s the one item here with real safety weight, alongside the multi-select decision from Part 1.</w:t>
+        <w:t>Confirm the support-line placement with Anu/PVAW first: it’s the one item here with real safety weight, alongside the multi-select decision from Part 1.</w:t>
       </w:r>
     </w:p>
     <w:p>
@@ -1871,7 +1871,7 @@
         <w:spacing w:after="60"/>
       </w:pPr>
       <w:r>
-        <w:t>The screen-by-screen text trims (Part 2, section 3) are low-risk copy swaps and could be applied any time once you’re happy with the wording — they don’t depend on any other decision.</w:t>
+        <w:t>The screen-by-screen text trims (Part 2, section 3) are low-risk copy swaps and could be applied any time once you’re happy with the wording; they don’t depend on any other decision.</w:t>
       </w:r>
     </w:p>
     <w:p>
@@ -1889,7 +1889,7 @@
         <w:spacing w:after="60"/>
       </w:pPr>
       <w:r>
-        <w:t>Fold both into the same round of screen changes as the Part 1 items where they overlap (e.g. Screen 06’s intro line, Screen 07/13’s wording) — rather than editing the same screen twice.</w:t>
+        <w:t>Fold both into the same round of screen changes as the Part 1 items where they overlap (e.g. Screen 06’s intro line, Screen 07/13’s wording), rather than editing the same screen twice.</w:t>
       </w:r>
     </w:p>
     <w:p>
@@ -1902,7 +1902,7 @@
           <w:color w:val="554D40"/>
           <w:sz w:val="19"/>
         </w:rPr>
-        <w:t>Once the support-line question and the two Part 1 scoring/design decisions are settled, everything else here — the text trims, the title consolidation, and the small/medium Part 1 screens — can be built together in one pass. Screen 13’s new branches drag-and-drop stays a separate, content-led follow-up.</w:t>
+        <w:t>Once the support-line question and the two Part 1 scoring/design decisions are settled, everything else here (the text trims, the title consolidation, and the small/medium Part 1 screens) can be built together in one pass. Screen 13’s new branches drag-and-drop stays a separate, content-led follow-up.</w:t>
       </w:r>
     </w:p>
     <w:sectPr>

</xml_diff>

<commit_message>
Lock in all confirmed decisions from Anu's second reply
Resolved both previously-ambiguous items from the highlighted email
(no-scroll approach = outcome tags per option; Screen 06 health
scoring = cap at worst, same as Screen 11) and marked every other
item as confirmed/approved/parked: support-line placement, one
title per screen, the text trims, and Anu's own refined wording for
three lines (Screens 05, 08, 15). Screen 13's branches drag-and-drop
stays parked per her explicit note. Document status changed from
"proposed" to "confirmed" throughout. Planning only, no game code
changed yet.

Co-Authored-By: Claude Sonnet 5 <noreply@anthropic.com>
</commit_message>
<xml_diff>
--- a/docs/Shaping-Change-Proposed-Changes-Anu.docx
+++ b/docs/Shaping-Change-Proposed-Changes-Anu.docx
@@ -23,7 +23,7 @@
           <w:color w:val="B0861A"/>
           <w:sz w:val="28"/>
         </w:rPr>
-        <w:t>Proposed Changes: Anu’s Feedback &amp; Ali’s Text Suggestions</w:t>
+        <w:t>Confirmed Changes: Anu’s Feedback &amp; Ali’s Text Suggestions</w:t>
       </w:r>
     </w:p>
     <w:p>
@@ -37,7 +37,7 @@
           <w:color w:val="554D40"/>
           <w:sz w:val="21"/>
         </w:rPr>
-        <w:t>Part 1 is a screen-by-screen proposal for what the multi-select and related changes would actually involve, based on Anu’s replies (17 September 2026) to Oleksandra’s comments. Part 2 covers Ali’s suggestions for cutting down on-screen text, from "Suggestions to the game.docx" (17 September 2026). This is a planning document, not a build; nothing here has been implemented yet.</w:t>
+        <w:t>Part 1 is a screen-by-screen proposal for what the multi-select and related changes actually involve, based on Anu’s replies (17 and 28 September 2026) to Oleksandra’s comments. Part 2 covers Ali’s suggestions for cutting down on-screen text, from "Suggestions to the game.docx", with Anu’s approval and her own refinements to three lines. Every item below is now confirmed except Screen 13, which stays parked. This document is not yet a build log; it records what’s approved to build.</w:t>
       </w:r>
     </w:p>
     <w:p>
@@ -82,10 +82,10 @@
       <w:r>
         <w:rPr>
           <w:b/>
-          <w:color w:val="B01A1A"/>
+          <w:color w:val="B0861A"/>
           <w:sz w:val="30"/>
         </w:rPr>
-        <w:t>An important constraint to weigh before we proceed</w:t>
+        <w:t>An important constraint, and how it’s being resolved</w:t>
       </w:r>
     </w:p>
     <w:p>
@@ -127,47 +127,33 @@
     </w:p>
     <w:p>
       <w:pPr>
-        <w:spacing w:after="120" w:before="80"/>
+        <w:spacing w:after="40" w:before="120"/>
       </w:pPr>
       <w:r>
         <w:rPr>
           <w:b/>
+          <w:color w:val="1E7A3C"/>
+          <w:sz w:val="18"/>
+        </w:rPr>
+        <w:t>CONFIRMED: Anu, 28 September 2026</w:t>
+      </w:r>
+    </w:p>
+    <w:p>
+      <w:pPr>
+        <w:spacing w:after="120" w:before="40"/>
+      </w:pPr>
+      <w:r>
+        <w:rPr>
+          <w:b w:val="0"/>
           <w:i w:val="0"/>
           <w:sz w:val="21"/>
         </w:rPr>
-        <w:t>Options worth deciding on:</w:t>
+        <w:t>Show a short one-line outcome tag per selected option, not the full paragraph, with the full reasoning shown only for the last option selected. Keeps every screen readable without scrolling, while still giving a learner a visible marker for everything they picked.</w:t>
       </w:r>
     </w:p>
     <w:p>
       <w:pPr>
-        <w:pStyle w:val="ListBullet"/>
-        <w:spacing w:after="60"/>
-      </w:pPr>
-      <w:r>
-        <w:t>Show only the reasoning for the MOST RECENTLY selected option (simplest, least visual clutter, but a learner might lose earlier reasoning they wanted to compare).</w:t>
-      </w:r>
-    </w:p>
-    <w:p>
-      <w:pPr>
-        <w:pStyle w:val="ListBullet"/>
-        <w:spacing w:after="60"/>
-      </w:pPr>
-      <w:r>
-        <w:t>Show a short one-line outcome tag per selected option (not the full paragraph), with the full reasoning only for the last one selected, as a middle ground.</w:t>
-      </w:r>
-    </w:p>
-    <w:p>
-      <w:pPr>
-        <w:pStyle w:val="ListBullet"/>
-        <w:spacing w:after="60"/>
-      </w:pPr>
-      <w:r>
-        <w:t>Let the reasoning area scroll internally while the rest of the panel (question, options, Continue) stays fixed. This would be the one place we’d deliberately break the "never scroll" rule, and only in a small contained area.</w:t>
-      </w:r>
-    </w:p>
-    <w:p>
-      <w:pPr>
-        <w:spacing w:after="120" w:before="80"/>
+        <w:spacing w:after="120" w:before="0"/>
       </w:pPr>
       <w:r>
         <w:rPr>
@@ -176,7 +162,7 @@
           <w:color w:val="554D40"/>
           <w:sz w:val="21"/>
         </w:rPr>
-        <w:t>This affects every screen below, so it’s flagged once here rather than repeated five times. Happy to propose a specific approach once we’ve agreed a direction.</w:t>
+        <w:t>The other two options considered (showing only the most recent selection’s reasoning; or letting just the reasoning area scroll internally) are not being used.</w:t>
       </w:r>
     </w:p>
     <w:p>
@@ -301,10 +287,10 @@
       <w:r>
         <w:rPr>
           <w:b/>
-          <w:color w:val="B01A1A"/>
+          <w:color w:val="1E7A3C"/>
           <w:sz w:val="18"/>
         </w:rPr>
-        <w:t>NEEDS A DECISION</w:t>
+        <w:t>CONFIRMED: Anu, 28 September 2026</w:t>
       </w:r>
     </w:p>
     <w:p>
@@ -317,7 +303,21 @@
           <w:i w:val="0"/>
           <w:sz w:val="21"/>
         </w:rPr>
-        <w:t>All three options currently reduce the tree’s health by a similar amount when picked alone (around 18 to 20 points). If a learner selects two or three of them together, does the health penalty stack (each one applies), or should it cap at the single worst option’s penalty? Stacking is more realistic (more harmful choices means more harm) but could push the tree toward the "damaged" outcome very quickly if someone selects all three just to read the feedback, which may not reflect what they’d actually do. Recommend capping at the worst-selected option’s penalty, so exploring options out of curiosity isn’t punished harder than committing to the single worst one. That said, this is a pedagogy call, not a dev one.</w:t>
+        <w:t>All three options currently reduce the tree’s health by a similar amount when picked alone (around 18 to 20 points). If a learner selects two or three of them together, the health penalty caps at the single worst selected option, rather than stacking, so exploring options out of curiosity isn’t punished harder than committing to the single worst one. This is the same logic confirmed for Screen 11 below, applied the same way here.</w:t>
+      </w:r>
+    </w:p>
+    <w:p>
+      <w:pPr>
+        <w:spacing w:after="120" w:before="0"/>
+      </w:pPr>
+      <w:r>
+        <w:rPr>
+          <w:b w:val="0"/>
+          <w:i/>
+          <w:color w:val="554D40"/>
+          <w:sz w:val="21"/>
+        </w:rPr>
+        <w:t>Anu highlighted the risk with stacking specifically (that it could push the tree to "damaged" very quickly just from exploring the options) rather than the capping recommendation itself. Reading that alongside her explicit agreement to the identical logic on Screen 11, this is being treated as confirmed; flagging the reasoning here in case that reading needs correcting.</w:t>
       </w:r>
     </w:p>
     <w:p>
@@ -545,10 +545,10 @@
       <w:r>
         <w:rPr>
           <w:b/>
-          <w:color w:val="B01A1A"/>
+          <w:color w:val="1E7A3C"/>
           <w:sz w:val="18"/>
         </w:rPr>
-        <w:t>NEEDS A DECISION</w:t>
+        <w:t>CONFIRMED: Anu, 28 September 2026</w:t>
       </w:r>
     </w:p>
     <w:p>
@@ -561,7 +561,7 @@
           <w:i w:val="0"/>
           <w:sz w:val="21"/>
         </w:rPr>
-        <w:t>Three of the four options here are healthy (plus 18 health each) and one is neutral ("I can stay in charge", minus 2 health). If a learner selects a mix, say two healthy beliefs and the neutral one, how should that combine? Recommend: any healthy selection counts as healthy overall (the neutral option only applies if it’s the ONLY thing selected), so exploring doesn’t accidentally cancel out a good choice. It’s the same underlying question as Screen 06, just in the opposite direction (mixing helps here, hurts there).</w:t>
+        <w:t>Three of the four options here are healthy (plus 18 health each) and one is neutral ("I can stay in charge", minus 2 health). If a learner selects a mix, say two healthy beliefs and the neutral one, any healthy selection counts as healthy overall; the neutral option only applies if it’s the ONLY thing selected, so exploring doesn’t accidentally cancel out a good choice. Explicitly agreed by Anu.</w:t>
       </w:r>
     </w:p>
     <w:p>
@@ -666,6 +666,19 @@
     </w:p>
     <w:p>
       <w:pPr>
+        <w:spacing w:after="40" w:before="120"/>
+      </w:pPr>
+      <w:r>
+        <w:rPr>
+          <w:b/>
+          <w:color w:val="1E7A3C"/>
+          <w:sz w:val="18"/>
+        </w:rPr>
+        <w:t>CONFIRMED: same logic as Screen 11</w:t>
+      </w:r>
+    </w:p>
+    <w:p>
+      <w:pPr>
         <w:spacing w:after="120" w:before="0"/>
       </w:pPr>
       <w:r>
@@ -675,7 +688,7 @@
           <w:color w:val="554D40"/>
           <w:sz w:val="21"/>
         </w:rPr>
-        <w:t>Same scoring question as Screen 11 applies here too (two healthy options plus one neutral "keep control but kinder").</w:t>
+        <w:t>Same scoring question as Screen 11 (two healthy options plus one neutral "keep control but kinder"), resolved the same way: any healthy pick counts as healthy overall.</w:t>
       </w:r>
     </w:p>
     <w:p>
@@ -779,7 +792,7 @@
           <w:color w:val="1C5A9C"/>
           <w:sz w:val="18"/>
         </w:rPr>
-        <w:t>NEEDS CONTENT INPUT, NOT JUST A DEV DECISION</w:t>
+        <w:t>PARKED FOR NOW: Anu, 28 September 2026</w:t>
       </w:r>
     </w:p>
     <w:p>
@@ -792,7 +805,7 @@
           <w:i w:val="0"/>
           <w:sz w:val="21"/>
         </w:rPr>
-        <w:t>Anu’s idea is a strong direction, but we’d need two or three concrete option choices and their wording before this can be built, e.g. "spend time together," "really listen when they talk," "keep the promise he made." Suggest this goes to the content/Edu side as its own small task, separate from the other four screens (which are ready to build once the scoring questions above are settled).</w:t>
+        <w:t>Anu’s idea is a strong direction, but we’d need two or three concrete option choices and their wording before this can be built, e.g. "spend time together," "really listen when they talk," "keep the promise he made." Anu has confirmed this is parked for now, as its own small content/Edu task, separate from the other four screens (which are all confirmed and ready to build).</w:t>
       </w:r>
     </w:p>
     <w:p>
@@ -813,7 +826,7 @@
           <w:color w:val="B01A1A"/>
           <w:sz w:val="19"/>
         </w:rPr>
-        <w:t>Large: a new mechanic end-to-end (content, drop-target wiring, new visual), and blocked on content before any build work can start.</w:t>
+        <w:t>Large: a new mechanic end-to-end (content, drop-target wiring, new visual). Not being built yet.</w:t>
       </w:r>
     </w:p>
     <w:p>
@@ -1007,10 +1020,10 @@
       <w:r>
         <w:rPr>
           <w:b/>
-          <w:color w:val="B01A1A"/>
+          <w:color w:val="1E7A3C"/>
           <w:sz w:val="18"/>
         </w:rPr>
-        <w:t>CONFLICTS WITH AN EXISTING SAFETY GUARDRAIL: NEEDS PVAW SIGN-OFF</w:t>
+        <w:t>APPROVED BY PVAW: Anu, 28 September 2026</w:t>
       </w:r>
     </w:p>
     <w:p>
@@ -1023,7 +1036,7 @@
           <w:i w:val="0"/>
           <w:sz w:val="21"/>
         </w:rPr>
-        <w:t>This isn’t a copy edit. It reverses a specific, documented pedagogy decision: "the 1800RESPECT / 000 support line shows on every screen," which is checked automatically on every content change (the build fails if any screen is missing it). That rule exists so the support line is always visible without a learner needing to reach the end of the activity. Removing it from every screen but the last is a real safety-design change, not a text-density one, so this needs Anu/PVAW’s explicit confirmation before it happens. It carries the same weight as the multi-select decision in Part 1, not something to fold in quietly alongside the wording trims below.</w:t>
+        <w:t>This wasn’t a copy edit; it reverses a specific, documented pedagogy decision: "the 1800RESPECT / 000 support line shows on every screen," which was checked automatically on every content change (the build previously failed if any screen was missing it). That rule existed so the support line was always visible without a learner needing to reach the end of the activity. Anu has now explicitly approved moving it to the last screen only, so this check will be updated to match rather than block it.</w:t>
       </w:r>
     </w:p>
     <w:p>
@@ -1037,7 +1050,7 @@
           <w:color w:val="554D40"/>
           <w:sz w:val="21"/>
         </w:rPr>
-        <w:t>If it does get confirmed, the reorder (000 before 1800RESPECT) is the easy part.</w:t>
+        <w:t>The reorder (000 before 1800RESPECT) is confirmed alongside it.</w:t>
       </w:r>
     </w:p>
     <w:p>
@@ -1079,6 +1092,19 @@
     </w:p>
     <w:p>
       <w:pPr>
+        <w:spacing w:after="40" w:before="120"/>
+      </w:pPr>
+      <w:r>
+        <w:rPr>
+          <w:b/>
+          <w:color w:val="1E7A3C"/>
+          <w:sz w:val="18"/>
+        </w:rPr>
+        <w:t>APPROVED: Anu, 28 September 2026</w:t>
+      </w:r>
+    </w:p>
+    <w:p>
+      <w:pPr>
         <w:spacing w:after="120" w:before="0"/>
       </w:pPr>
       <w:r>
@@ -1087,7 +1113,7 @@
           <w:i w:val="0"/>
           <w:sz w:val="21"/>
         </w:rPr>
-        <w:t>Reading this as: keep the step-progress indicator (the dots plus "Step X of 10", since that’s orientation, not really a "title") and the actual question/heading, and drop the middle line (the "Phase 1 · ..." tag), which mostly repeats what the heading already says. Worth confirming that’s the intended reading before it’s applied everywhere, since it touches every single screen in the game.</w:t>
+        <w:t>Reading this as: keep the step-progress indicator (the dots plus "Step X of 10", since that’s orientation, not really a "title") and the actual question/heading, and drop the middle line (the "Phase 1 · ..." tag), which mostly repeats what the heading already says.</w:t>
       </w:r>
     </w:p>
     <w:p>
@@ -1108,7 +1134,7 @@
           <w:color w:val="1E7A3C"/>
           <w:sz w:val="19"/>
         </w:rPr>
-        <w:t>Small: a consistent CSS/markup change once the interpretation above is confirmed.</w:t>
+        <w:t>Small: a consistent CSS/markup change.</w:t>
       </w:r>
     </w:p>
     <w:p>
@@ -1126,6 +1152,19 @@
     </w:p>
     <w:p>
       <w:pPr>
+        <w:spacing w:after="40" w:before="120"/>
+      </w:pPr>
+      <w:r>
+        <w:rPr>
+          <w:b/>
+          <w:color w:val="1E7A3C"/>
+          <w:sz w:val="18"/>
+        </w:rPr>
+        <w:t>APPROVED: Anu, 28 September 2026</w:t>
+      </w:r>
+    </w:p>
+    <w:p>
+      <w:pPr>
         <w:spacing w:after="120" w:before="0"/>
       </w:pPr>
       <w:r>
@@ -1135,7 +1174,7 @@
           <w:color w:val="554D40"/>
           <w:sz w:val="21"/>
         </w:rPr>
-        <w:t>Ali’s versions are generally shorter and keep the core teaching point. A couple of specific personal-detail callbacks (e.g. "Since 2023..." on the tree screen) are dropped in the interest of brevity, flagged where that happens; otherwise nothing substantive seems to be lost.</w:t>
+        <w:t>Ali’s versions are generally shorter and keep the core teaching point. A couple of specific personal-detail callbacks (e.g. "Since 2023..." on the tree screen) are dropped in the interest of brevity, flagged where that happens; otherwise nothing substantive seems to be lost. Anu refined the ending of three of these herself; her final wording is shown under those three screens below and takes precedence over Ali’s original draft for those lines.</w:t>
       </w:r>
     </w:p>
     <w:p>
@@ -1314,6 +1353,29 @@
     </w:p>
     <w:p>
       <w:pPr>
+        <w:spacing w:before="40" w:after="120"/>
+        <w:ind w:left="200"/>
+        <w:shd w:val="clear" w:color="auto" w:fill="EAF1FA"/>
+      </w:pPr>
+      <w:r>
+        <w:rPr>
+          <w:b/>
+          <w:color w:val="1C5A9C"/>
+          <w:sz w:val="19"/>
+        </w:rPr>
+        <w:t xml:space="preserve">Approved final wording (Anu):  </w:t>
+      </w:r>
+      <w:r>
+        <w:rPr>
+          <w:b/>
+          <w:color w:val="2A1F10"/>
+          <w:sz w:val="19"/>
+        </w:rPr>
+        <w:t>Orion is facing challenges many new arrivals experience. Finding work is difficult, social connections are limited, and he feels he has lost the respect and status he once had. Unsure of what comes next, he has a choice about how he acts at home and outside.</w:t>
+      </w:r>
+    </w:p>
+    <w:p>
+      <w:pPr>
         <w:spacing w:before="360" w:after="40"/>
       </w:pPr>
       <w:r>
@@ -1502,6 +1564,29 @@
     </w:p>
     <w:p>
       <w:pPr>
+        <w:spacing w:before="40" w:after="120"/>
+        <w:ind w:left="200"/>
+        <w:shd w:val="clear" w:color="auto" w:fill="EAF1FA"/>
+      </w:pPr>
+      <w:r>
+        <w:rPr>
+          <w:b/>
+          <w:color w:val="1C5A9C"/>
+          <w:sz w:val="19"/>
+        </w:rPr>
+        <w:t xml:space="preserve">Approved final wording (Anu):  </w:t>
+      </w:r>
+      <w:r>
+        <w:rPr>
+          <w:b/>
+          <w:color w:val="2A1F10"/>
+          <w:sz w:val="19"/>
+        </w:rPr>
+        <w:t>Beliefs shape how we respond to pressure. The challenges are the same, but different beliefs can lead to different choices. Our choices can change the outcomes and impact those we care for.</w:t>
+      </w:r>
+    </w:p>
+    <w:p>
+      <w:pPr>
         <w:spacing w:after="120" w:before="40"/>
       </w:pPr>
       <w:r>
@@ -1511,7 +1596,21 @@
           <w:color w:val="554D40"/>
           <w:sz w:val="21"/>
         </w:rPr>
-        <w:t>Ali also flagged the heading itself, "What belief might sit behind this?", as reading better in the plural ("What beliefs..."), since there are several to choose from. Worth a quick confirm since it’s a matter of preference either way, not a correction.</w:t>
+        <w:t>Note: Anu’s version replaces the "no wrong choice" reassurance with a consequence-focused ending. Flagging that it’s a small tone shift, not a compliance issue, since Anu owns the pedagogy tone; happy to leave as is or add the reassurance back in elsewhere if that would be preferred.</w:t>
+      </w:r>
+    </w:p>
+    <w:p>
+      <w:pPr>
+        <w:spacing w:after="120" w:before="40"/>
+      </w:pPr>
+      <w:r>
+        <w:rPr>
+          <w:b w:val="0"/>
+          <w:i/>
+          <w:color w:val="554D40"/>
+          <w:sz w:val="21"/>
+        </w:rPr>
+        <w:t>Ali also flagged the heading itself, "What belief might sit behind this?", as reading better in the plural ("What beliefs..."), since there are several to choose from. Still worth a quick confirm.</w:t>
       </w:r>
     </w:p>
     <w:p>
@@ -1704,6 +1803,29 @@
     </w:p>
     <w:p>
       <w:pPr>
+        <w:spacing w:before="40" w:after="120"/>
+        <w:ind w:left="200"/>
+        <w:shd w:val="clear" w:color="auto" w:fill="EAF1FA"/>
+      </w:pPr>
+      <w:r>
+        <w:rPr>
+          <w:b/>
+          <w:color w:val="1C5A9C"/>
+          <w:sz w:val="19"/>
+        </w:rPr>
+        <w:t xml:space="preserve">Approved final wording (Anu):  </w:t>
+      </w:r>
+      <w:r>
+        <w:rPr>
+          <w:b/>
+          <w:color w:val="2A1F10"/>
+          <w:sz w:val="19"/>
+        </w:rPr>
+        <w:t>Some things improved, while other challenges remained. Orion still held onto some control, but he was trying to change. Change is a journey, and taking small steps allows you to begin making a difference.</w:t>
+      </w:r>
+    </w:p>
+    <w:p>
+      <w:pPr>
         <w:spacing w:before="360" w:after="40"/>
       </w:pPr>
       <w:r>
@@ -1850,28 +1972,36 @@
       <w:r>
         <w:rPr>
           <w:b/>
-          <w:color w:val="B0861A"/>
+          <w:color w:val="1E7A3C"/>
           <w:sz w:val="26"/>
         </w:rPr>
-        <w:t>Suggested order to tackle all of this</w:t>
+        <w:t>Status: everything below is confirmed</w:t>
       </w:r>
     </w:p>
     <w:p>
       <w:pPr>
-        <w:pStyle w:val="ListBullet"/>
-        <w:spacing w:after="60"/>
+        <w:spacing w:after="120" w:before="0"/>
       </w:pPr>
       <w:r>
-        <w:t>Confirm the support-line placement with Anu/PVAW first: it’s the one item here with real safety weight, alongside the multi-select decision from Part 1.</w:t>
+        <w:rPr>
+          <w:b w:val="0"/>
+          <w:i w:val="0"/>
+          <w:sz w:val="21"/>
+        </w:rPr>
+        <w:t>As of Anu’s reply on 28 September 2026, every open item above is resolved: the no-scroll approach, both scoring questions, the support-line placement, the title consolidation, and the text trims (including her own three refined endings). The only item not being built now is Screen 13’s new branches drag-and-drop, which stays parked for a separate content-led follow-up.</w:t>
       </w:r>
     </w:p>
     <w:p>
       <w:pPr>
-        <w:pStyle w:val="ListBullet"/>
-        <w:spacing w:after="60"/>
+        <w:spacing w:after="120" w:before="120"/>
       </w:pPr>
       <w:r>
-        <w:t>The screen-by-screen text trims (Part 2, section 3) are low-risk copy swaps and could be applied any time once you’re happy with the wording; they don’t depend on any other decision.</w:t>
+        <w:rPr>
+          <w:b/>
+          <w:i w:val="0"/>
+          <w:sz w:val="21"/>
+        </w:rPr>
+        <w:t>Build order:</w:t>
       </w:r>
     </w:p>
     <w:p>
@@ -1880,7 +2010,7 @@
         <w:spacing w:after="60"/>
       </w:pPr>
       <w:r>
-        <w:t>The "one title per screen" change touches every screen’s layout, so worth doing in the same pass as the text trims rather than separately.</w:t>
+        <w:t>One combined pass covering: the multi-select rebuild for Screens 06, 08, 11, 12 and 22; the colour-coded outcomes on Screen 06; the progressive-expression feature on Screen 11; the support-line placement change; the "one title per screen" layout change; and the text trims across all eleven screens/lines, using Anu’s wording where she supplied it.</w:t>
       </w:r>
     </w:p>
     <w:p>
@@ -1889,7 +2019,7 @@
         <w:spacing w:after="60"/>
       </w:pPr>
       <w:r>
-        <w:t>Fold both into the same round of screen changes as the Part 1 items where they overlap (e.g. Screen 06’s intro line, Screen 07/13’s wording), rather than editing the same screen twice.</w:t>
+        <w:t>Screen 13’s branches drag-and-drop, once the content side has worked out the specific option wording.</w:t>
       </w:r>
     </w:p>
     <w:p>
@@ -1902,7 +2032,7 @@
           <w:color w:val="554D40"/>
           <w:sz w:val="19"/>
         </w:rPr>
-        <w:t>Once the support-line question and the two Part 1 scoring/design decisions are settled, everything else here (the text trims, the title consolidation, and the small/medium Part 1 screens) can be built together in one pass. Screen 13’s new branches drag-and-drop stays a separate, content-led follow-up.</w:t>
+        <w:t>Ready to start on the confirmed build.</w:t>
       </w:r>
     </w:p>
     <w:sectPr>

</xml_diff>